<commit_message>
docs: fill delivery placeholders + add client preview PDF
- Party/contact placeholder များ ဖြည့်ပြီး (vendor: Moe Htet · client:
  Panellist Business Services · info@panellistmm.com)
- Doc 06/08 SLA + term target များကို proposed default ဖြင့်ဖြည့် (owner
  confirm ရန်): uptime best-effort 99%, critical ack 1 business day,
  non-critical 3–5 business days, term month-to-month, notice 30 days,
  RTO ≤ 1 business day, RPO ≤ 24h
- filled value များကို code-style မှ plain text သို့ ပြင် (client-facing)
- artifacts re-compile + Client Preview PDF (Doc 00+01) ထည့် — final
  payment မတိုင်မီ share ရန် safe subset

Co-Authored-By: Claude Opus 4.8 <noreply@anthropic.com>
Claude-Session: https://claude.ai/code/session_01Ks3CCTJCZ6ewxevY6syL92
</commit_message>
<xml_diff>
--- a/delivery/artifacts/Panellist-HR-AI-Delivery-Dossier.docx
+++ b/delivery/artifacts/Panellist-HR-AI-Delivery-Dossier.docx
@@ -437,17 +437,7 @@
     </w:p>
     <w:p>
       <w:r>
-        <w:t xml:space="preserve">ဤ document သည် </w:t>
-      </w:r>
-      <w:r>
-        <w:rPr>
-          <w:rFonts w:ascii="Consolas" w:hAnsi="Consolas" w:cs="Consolas"/>
-          <w:sz w:val="18"/>
-        </w:rPr>
-        <w:t>&lt;CLIENT_NAME&gt;</w:t>
-      </w:r>
-      <w:r>
-        <w:t xml:space="preserve"> အတွက် တည်ဆောက်ပြီးစီးသော </w:t>
+        <w:t xml:space="preserve">ဤ document သည် Panellist Business Services အတွက် တည်ဆောက်ပြီးစီးသော </w:t>
       </w:r>
       <w:r>
         <w:rPr>
@@ -1188,20 +1178,7 @@
               <w:rPr>
                 <w:sz w:val="18"/>
               </w:rPr>
-              <w:t xml:space="preserve"> (</w:t>
-            </w:r>
-            <w:r>
-              <w:rPr>
-                <w:rFonts w:ascii="Consolas" w:hAnsi="Consolas" w:cs="Consolas"/>
-                <w:sz w:val="18"/>
-              </w:rPr>
-              <w:t>&lt;CLIENT_GMAIL&gt;</w:t>
-            </w:r>
-            <w:r>
-              <w:rPr>
-                <w:sz w:val="18"/>
-              </w:rPr>
-              <w:t>)</w:t>
+              <w:t xml:space="preserve"> (info@panellistmm.com)</w:t>
             </w:r>
           </w:p>
         </w:tc>
@@ -4098,17 +4075,7 @@
         <w:t>client ၏ကိုယ်ပိုင် Supabase account</w:t>
       </w:r>
       <w:r>
-        <w:t xml:space="preserve"> (</w:t>
-      </w:r>
-      <w:r>
-        <w:rPr>
-          <w:rFonts w:ascii="Consolas" w:hAnsi="Consolas" w:cs="Consolas"/>
-          <w:sz w:val="18"/>
-        </w:rPr>
-        <w:t>&lt;CLIENT_GMAIL&gt;</w:t>
-      </w:r>
-      <w:r>
-        <w:t>) သို့ ownership အပြည့်ဖြင့် transfer လုပ်ရန်။ Transfer ပြီးနောက် client သည် database ကို 100% ပိုင်ဆိုင်သည်။</w:t>
+        <w:t xml:space="preserve"> (info@panellistmm.com) သို့ ownership အပြည့်ဖြင့် transfer လုပ်ရန်။ Transfer ပြီးနောက် client သည် database ကို 100% ပိုင်ဆိုင်သည်။</w:t>
       </w:r>
     </w:p>
     <w:p>
@@ -4333,17 +4300,7 @@
         <w:pStyle w:val="ListBullet"/>
       </w:pPr>
       <w:r>
-        <w:t>☐ Client Supabase account (</w:t>
-      </w:r>
-      <w:r>
-        <w:rPr>
-          <w:rFonts w:ascii="Consolas" w:hAnsi="Consolas" w:cs="Consolas"/>
-          <w:sz w:val="18"/>
-        </w:rPr>
-        <w:t>&lt;CLIENT_GMAIL&gt;</w:t>
-      </w:r>
-      <w:r>
-        <w:t>) active</w:t>
+        <w:t>☐ Client Supabase account (info@panellistmm.com) active</w:t>
       </w:r>
     </w:p>
     <w:p>
@@ -6928,20 +6885,7 @@
               <w:rPr>
                 <w:sz w:val="18"/>
               </w:rPr>
-              <w:t xml:space="preserve"> (</w:t>
-            </w:r>
-            <w:r>
-              <w:rPr>
-                <w:rFonts w:ascii="Consolas" w:hAnsi="Consolas" w:cs="Consolas"/>
-                <w:sz w:val="18"/>
-              </w:rPr>
-              <w:t>&lt;CLIENT_GMAIL&gt;</w:t>
-            </w:r>
-            <w:r>
-              <w:rPr>
-                <w:sz w:val="18"/>
-              </w:rPr>
-              <w:t>)</w:t>
+              <w:t xml:space="preserve"> (info@panellistmm.com)</w:t>
             </w:r>
           </w:p>
         </w:tc>
@@ -7554,17 +7498,7 @@
         <w:pStyle w:val="ListNumber"/>
       </w:pPr>
       <w:r>
-        <w:t>Client OpenRouter account (</w:t>
-      </w:r>
-      <w:r>
-        <w:rPr>
-          <w:rFonts w:ascii="Consolas" w:hAnsi="Consolas" w:cs="Consolas"/>
-          <w:sz w:val="18"/>
-        </w:rPr>
-        <w:t>&lt;CLIENT_GMAIL&gt;</w:t>
-      </w:r>
-      <w:r>
-        <w:t xml:space="preserve">) → </w:t>
+        <w:t xml:space="preserve">Client OpenRouter account (info@panellistmm.com) → </w:t>
       </w:r>
       <w:r>
         <w:rPr>
@@ -9078,10 +9012,9 @@
           <w:p>
             <w:r>
               <w:rPr>
-                <w:rFonts w:ascii="Consolas" w:hAnsi="Consolas" w:cs="Consolas"/>
-                <w:sz w:val="18"/>
-              </w:rPr>
-              <w:t>&lt;VENDOR_NAME&gt;</w:t>
+                <w:sz w:val="18"/>
+              </w:rPr>
+              <w:t>Moe Htet</w:t>
             </w:r>
           </w:p>
         </w:tc>
@@ -9109,10 +9042,9 @@
           <w:p>
             <w:r>
               <w:rPr>
-                <w:rFonts w:ascii="Consolas" w:hAnsi="Consolas" w:cs="Consolas"/>
-                <w:sz w:val="18"/>
-              </w:rPr>
-              <w:t>&lt;CLIENT_NAME&gt;</w:t>
+                <w:sz w:val="18"/>
+              </w:rPr>
+              <w:t>Panellist Business Services</w:t>
             </w:r>
           </w:p>
         </w:tc>
@@ -9138,10 +9070,9 @@
           <w:p>
             <w:r>
               <w:rPr>
-                <w:rFonts w:ascii="Consolas" w:hAnsi="Consolas" w:cs="Consolas"/>
-                <w:sz w:val="18"/>
-              </w:rPr>
-              <w:t>&lt;EFFECTIVE_DATE&gt;</w:t>
+                <w:sz w:val="18"/>
+              </w:rPr>
+              <w:t>____________ (signing ရက်စွဲ)</w:t>
             </w:r>
           </w:p>
         </w:tc>
@@ -9594,20 +9525,7 @@
               <w:rPr>
                 <w:sz w:val="18"/>
               </w:rPr>
-              <w:t xml:space="preserve">Best-effort </w:t>
-            </w:r>
-            <w:r>
-              <w:rPr>
-                <w:rFonts w:ascii="Consolas" w:hAnsi="Consolas" w:cs="Consolas"/>
-                <w:sz w:val="18"/>
-              </w:rPr>
-              <w:t>&lt;TARGET, e.g. 99%&gt;</w:t>
-            </w:r>
-            <w:r>
-              <w:rPr>
-                <w:sz w:val="18"/>
-              </w:rPr>
-              <w:t xml:space="preserve"> monthly (server infra limitation အလိုက်)</w:t>
+              <w:t>Best-effort 99% monthly (server infra limitation အလိုက်)</w:t>
             </w:r>
           </w:p>
         </w:tc>
@@ -9635,16 +9553,9 @@
           <w:p>
             <w:r>
               <w:rPr>
-                <w:rFonts w:ascii="Consolas" w:hAnsi="Consolas" w:cs="Consolas"/>
-                <w:sz w:val="18"/>
-              </w:rPr>
-              <w:t>&lt;e.g. 1 business day&gt;</w:t>
-            </w:r>
-            <w:r>
-              <w:rPr>
-                <w:sz w:val="18"/>
-              </w:rPr>
-              <w:t xml:space="preserve"> အတွင်း acknowledge</w:t>
+                <w:sz w:val="18"/>
+              </w:rPr>
+              <w:t>1 business day အတွင်း acknowledge</w:t>
             </w:r>
           </w:p>
         </w:tc>
@@ -9670,10 +9581,9 @@
           <w:p>
             <w:r>
               <w:rPr>
-                <w:rFonts w:ascii="Consolas" w:hAnsi="Consolas" w:cs="Consolas"/>
-                <w:sz w:val="18"/>
-              </w:rPr>
-              <w:t>&lt;e.g. 3–5 business days&gt;</w:t>
+                <w:sz w:val="18"/>
+              </w:rPr>
+              <w:t>3–5 business days</w:t>
             </w:r>
           </w:p>
         </w:tc>
@@ -9729,10 +9639,9 @@
           <w:p>
             <w:r>
               <w:rPr>
-                <w:rFonts w:ascii="Consolas" w:hAnsi="Consolas" w:cs="Consolas"/>
-                <w:sz w:val="18"/>
-              </w:rPr>
-              <w:t>&lt;VENDOR_CONTACT&gt;</w:t>
+                <w:sz w:val="18"/>
+              </w:rPr>
+              <w:t>Moe Htet · 09-969222535</w:t>
             </w:r>
           </w:p>
         </w:tc>
@@ -9987,10 +9896,9 @@
           <w:p>
             <w:r>
               <w:rPr>
-                <w:rFonts w:ascii="Consolas" w:hAnsi="Consolas" w:cs="Consolas"/>
-                <w:sz w:val="18"/>
-              </w:rPr>
-              <w:t>&lt;e.g. month-to-month / 6-month&gt;</w:t>
+                <w:sz w:val="18"/>
+              </w:rPr>
+              <w:t>month-to-month</w:t>
             </w:r>
           </w:p>
         </w:tc>
@@ -10018,10 +9926,9 @@
           <w:p>
             <w:r>
               <w:rPr>
-                <w:rFonts w:ascii="Consolas" w:hAnsi="Consolas" w:cs="Consolas"/>
-                <w:sz w:val="18"/>
-              </w:rPr>
-              <w:t>&lt;e.g. 30 days&gt;</w:t>
+                <w:sz w:val="18"/>
+              </w:rPr>
+              <w:t>30 days</w:t>
             </w:r>
           </w:p>
         </w:tc>
@@ -10214,10 +10121,9 @@
           <w:p>
             <w:r>
               <w:rPr>
-                <w:rFonts w:ascii="Consolas" w:hAnsi="Consolas" w:cs="Consolas"/>
-                <w:sz w:val="18"/>
-              </w:rPr>
-              <w:t>&lt;VENDOR_NAME&gt;</w:t>
+                <w:sz w:val="18"/>
+              </w:rPr>
+              <w:t>Moe Htet</w:t>
             </w:r>
           </w:p>
         </w:tc>
@@ -10271,10 +10177,9 @@
           <w:p>
             <w:r>
               <w:rPr>
-                <w:rFonts w:ascii="Consolas" w:hAnsi="Consolas" w:cs="Consolas"/>
-                <w:sz w:val="18"/>
-              </w:rPr>
-              <w:t>&lt;CLIENT_NAME&gt;</w:t>
+                <w:sz w:val="18"/>
+              </w:rPr>
+              <w:t>Panellist Business Services</w:t>
             </w:r>
           </w:p>
         </w:tc>
@@ -12264,10 +12169,9 @@
           <w:p>
             <w:r>
               <w:rPr>
-                <w:rFonts w:ascii="Consolas" w:hAnsi="Consolas" w:cs="Consolas"/>
-                <w:sz w:val="18"/>
-              </w:rPr>
-              <w:t>&lt;CLIENT_NAME&gt;</w:t>
+                <w:sz w:val="18"/>
+              </w:rPr>
+              <w:t>Panellist Business Services</w:t>
             </w:r>
           </w:p>
         </w:tc>
@@ -12321,10 +12225,9 @@
           <w:p>
             <w:r>
               <w:rPr>
-                <w:rFonts w:ascii="Consolas" w:hAnsi="Consolas" w:cs="Consolas"/>
-                <w:sz w:val="18"/>
-              </w:rPr>
-              <w:t>&lt;VENDOR_NAME&gt;</w:t>
+                <w:sz w:val="18"/>
+              </w:rPr>
+              <w:t>Moe Htet</w:t>
             </w:r>
           </w:p>
         </w:tc>
@@ -12538,10 +12441,9 @@
           <w:p>
             <w:r>
               <w:rPr>
-                <w:rFonts w:ascii="Consolas" w:hAnsi="Consolas" w:cs="Consolas"/>
-                <w:sz w:val="18"/>
-              </w:rPr>
-              <w:t>&lt;VENDOR_CONTACT&gt;</w:t>
+                <w:sz w:val="18"/>
+              </w:rPr>
+              <w:t>Moe Htet · 09-969222535</w:t>
             </w:r>
           </w:p>
         </w:tc>
@@ -12552,10 +12454,9 @@
           <w:p>
             <w:r>
               <w:rPr>
-                <w:rFonts w:ascii="Consolas" w:hAnsi="Consolas" w:cs="Consolas"/>
-                <w:sz w:val="18"/>
-              </w:rPr>
-              <w:t>&lt;e.g. 1 business day&gt;</w:t>
+                <w:sz w:val="18"/>
+              </w:rPr>
+              <w:t>1 business day</w:t>
             </w:r>
           </w:p>
         </w:tc>
@@ -12598,10 +12499,9 @@
           <w:p>
             <w:r>
               <w:rPr>
-                <w:rFonts w:ascii="Consolas" w:hAnsi="Consolas" w:cs="Consolas"/>
-                <w:sz w:val="18"/>
-              </w:rPr>
-              <w:t>&lt;VENDOR_CONTACT&gt;</w:t>
+                <w:sz w:val="18"/>
+              </w:rPr>
+              <w:t>Moe Htet · 09-969222535</w:t>
             </w:r>
           </w:p>
         </w:tc>
@@ -12613,10 +12513,9 @@
           <w:p>
             <w:r>
               <w:rPr>
-                <w:rFonts w:ascii="Consolas" w:hAnsi="Consolas" w:cs="Consolas"/>
-                <w:sz w:val="18"/>
-              </w:rPr>
-              <w:t>&lt;e.g. 3–5 business days&gt;</w:t>
+                <w:sz w:val="18"/>
+              </w:rPr>
+              <w:t>3–5 business days</w:t>
             </w:r>
           </w:p>
         </w:tc>
@@ -12656,16 +12555,9 @@
           <w:p>
             <w:r>
               <w:rPr>
-                <w:rFonts w:ascii="Consolas" w:hAnsi="Consolas" w:cs="Consolas"/>
-                <w:sz w:val="18"/>
-              </w:rPr>
-              <w:t>&lt;VENDOR_CONTACT&gt;</w:t>
-            </w:r>
-            <w:r>
-              <w:rPr>
-                <w:sz w:val="18"/>
-              </w:rPr>
-              <w:t xml:space="preserve"> (priority)</w:t>
+                <w:sz w:val="18"/>
+              </w:rPr>
+              <w:t>Moe Htet · 09-969222535 (priority)</w:t>
             </w:r>
           </w:p>
         </w:tc>
@@ -12678,14 +12570,7 @@
               <w:rPr>
                 <w:sz w:val="18"/>
               </w:rPr>
-              <w:t xml:space="preserve">acknowledge </w:t>
-            </w:r>
-            <w:r>
-              <w:rPr>
-                <w:rFonts w:ascii="Consolas" w:hAnsi="Consolas" w:cs="Consolas"/>
-                <w:sz w:val="18"/>
-              </w:rPr>
-              <w:t>&lt;e.g. same/next business day&gt;</w:t>
+              <w:t>acknowledge same / next business day</w:t>
             </w:r>
           </w:p>
         </w:tc>
@@ -12700,17 +12585,7 @@
         <w:t>Escalation path</w:t>
       </w:r>
       <w:r>
-        <w:t xml:space="preserve"> — Client HR/admin → Vendor support (</w:t>
-      </w:r>
-      <w:r>
-        <w:rPr>
-          <w:rFonts w:ascii="Consolas" w:hAnsi="Consolas" w:cs="Consolas"/>
-          <w:sz w:val="18"/>
-        </w:rPr>
-        <w:t>&lt;VENDOR_CONTACT&gt;</w:t>
-      </w:r>
-      <w:r>
-        <w:t>) → Vendor investigates n8n/Supabase/API → Fix or upstream provider escalation。</w:t>
+        <w:t xml:space="preserve"> — Client HR/admin → Vendor support (Moe Htet · 09-969222535) → Vendor investigates n8n/Supabase/API → Fix or upstream provider escalation。</w:t>
       </w:r>
     </w:p>
     <w:p>
@@ -13665,10 +13540,9 @@
           <w:p>
             <w:r>
               <w:rPr>
-                <w:rFonts w:ascii="Consolas" w:hAnsi="Consolas" w:cs="Consolas"/>
-                <w:sz w:val="18"/>
-              </w:rPr>
-              <w:t>&lt;e.g. within 1 business day&gt;</w:t>
+                <w:sz w:val="18"/>
+              </w:rPr>
+              <w:t>within 1 business day</w:t>
             </w:r>
           </w:p>
         </w:tc>
@@ -13709,10 +13583,9 @@
           <w:p>
             <w:r>
               <w:rPr>
-                <w:rFonts w:ascii="Consolas" w:hAnsi="Consolas" w:cs="Consolas"/>
-                <w:sz w:val="18"/>
-              </w:rPr>
-              <w:t>&lt;= backup interval&gt;</w:t>
+                <w:sz w:val="18"/>
+              </w:rPr>
+              <w:t>≤ 24 hours (daily backup)</w:t>
             </w:r>
           </w:p>
         </w:tc>
@@ -14906,21 +14779,7 @@
         <w:rPr>
           <w:i/>
         </w:rPr>
-        <w:t xml:space="preserve"> — enhancement / custom development discussion အတွက် — </w:t>
-      </w:r>
-      <w:r>
-        <w:rPr>
-          <w:rFonts w:ascii="Consolas" w:hAnsi="Consolas" w:cs="Consolas"/>
-          <w:i/>
-          <w:sz w:val="18"/>
-        </w:rPr>
-        <w:t>&lt;VENDOR_CONTACT&gt;</w:t>
-      </w:r>
-      <w:r>
-        <w:rPr>
-          <w:i/>
-        </w:rPr>
-        <w:t>。</w:t>
+        <w:t xml:space="preserve"> — enhancement / custom development discussion အတွက် — Moe Htet · 09-969222535。</w:t>
       </w:r>
     </w:p>
     <w:sectPr>

</xml_diff>

<commit_message>
docs: fix DOCX cover placeholders (vendor/client names)
DOCX cover meta table က `<CLIENT_NAME>`/`<VENDOR_NAME>` placeholder hardcode
ဖြစ်နေခဲ့သည် — Moe Htet / Panellist Business Services သို့ ပြင်ပြီး regenerate။
Markdown body နှင့် PDF တွင် placeholder မကျန်တော့ပါ။

Co-Authored-By: Claude Opus 4.8 <noreply@anthropic.com>
Claude-Session: https://claude.ai/code/session_01Ks3CCTJCZ6ewxevY6syL92
</commit_message>
<xml_diff>
--- a/delivery/artifacts/Panellist-HR-AI-Delivery-Dossier.docx
+++ b/delivery/artifacts/Panellist-HR-AI-Delivery-Dossier.docx
@@ -81,7 +81,7 @@
               <w:rPr>
                 <w:b/>
               </w:rPr>
-              <w:t>&lt;CLIENT_NAME&gt; (Panellist)</w:t>
+              <w:t>Panellist Business Services</w:t>
             </w:r>
           </w:p>
         </w:tc>
@@ -112,7 +112,7 @@
               <w:rPr>
                 <w:b/>
               </w:rPr>
-              <w:t>&lt;VENDOR_NAME&gt;</w:t>
+              <w:t>Moe Htet</w:t>
             </w:r>
           </w:p>
         </w:tc>

</xml_diff>